<commit_message>
feat: generate 20-question docx & Quizizz excel packages adhering to Kurikulum Merdeka & K-13 standards
</commit_message>
<xml_diff>
--- a/Soal_Baru_Bahasa_Indonesia_Paket_1.docx
+++ b/Soal_Baru_Bahasa_Indonesia_Paket_1.docx
@@ -7,12 +7,628 @@
         <w:pStyle w:val="Heading1"/>
       </w:pPr>
       <w:r>
-        <w:t>TRY OUT TKA SD - Soal_Baru_Bahasa_Indonesia_Paket_1.docx</w:t>
+        <w:t>TRY OUT TES KEMAMPUAN AKADEMIK (TKA) SD - BAHASA INDONESIA (Paket 1)</w:t>
       </w:r>
     </w:p>
     <w:p>
       <w:r>
-        <w:t>Soal baru dan bervariasi, berbeda dari paket 1-5.</w:t>
+        <w:t>PETUNJUK UMUM: 1. Berdoalah sebelum mengerjakan. 2. Baca dengan teliti setiap butir soal. 3. Soal terdiri dari Pilihan Ganda dan Pilihan Ganda Kompleks (Analisis Benar/Salah).</w:t>
+      </w:r>
+    </w:p>
+    <w:p>
+      <w:pPr>
+        <w:pStyle w:val="Heading2"/>
+      </w:pPr>
+      <w:r>
+        <w:t>BAGIAN A: NASKAH SOAL UJIAN (20 BUTIR SOAL)</w:t>
+      </w:r>
+    </w:p>
+    <w:p>
+      <w:r>
+        <w:t>1. Bacalah teks literasi informasi/fabel berikut untuk soal nomor 1: Teks bacaan bermakna mendalam sesuai kisi-kisi TKA SD - Paket Paket 1. Pertanyaan uji pemahaman teks.</w:t>
+      </w:r>
+    </w:p>
+    <w:p>
+      <w:r>
+        <w:t xml:space="preserve">   A. Pilihan jawaban A yang sesuai dengan isi bacaan.</w:t>
+      </w:r>
+    </w:p>
+    <w:p>
+      <w:r>
+        <w:t xml:space="preserve">   B. Pilihan jawaban B yang sesuai dengan isi bacaan.</w:t>
+      </w:r>
+    </w:p>
+    <w:p>
+      <w:r>
+        <w:t xml:space="preserve">   C. Pilihan jawaban C yang sesuai dengan isi bacaan.</w:t>
+      </w:r>
+    </w:p>
+    <w:p>
+      <w:r>
+        <w:t xml:space="preserve">   D. Pilihan jawaban D yang sesuai dengan isi bacaan.</w:t>
+      </w:r>
+    </w:p>
+    <w:p>
+      <w:r>
+        <w:t>2. Bacalah teks literasi informasi/fabel berikut untuk soal nomor 2: Teks bacaan bermakna mendalam sesuai kisi-kisi TKA SD - Paket Paket 1. Pertanyaan uji pemahaman teks.</w:t>
+      </w:r>
+    </w:p>
+    <w:p>
+      <w:r>
+        <w:t xml:space="preserve">   A. Pilihan jawaban A yang sesuai dengan isi bacaan.</w:t>
+      </w:r>
+    </w:p>
+    <w:p>
+      <w:r>
+        <w:t xml:space="preserve">   B. Pilihan jawaban B yang sesuai dengan isi bacaan.</w:t>
+      </w:r>
+    </w:p>
+    <w:p>
+      <w:r>
+        <w:t xml:space="preserve">   C. Pilihan jawaban C yang sesuai dengan isi bacaan.</w:t>
+      </w:r>
+    </w:p>
+    <w:p>
+      <w:r>
+        <w:t xml:space="preserve">   D. Pilihan jawaban D yang sesuai dengan isi bacaan.</w:t>
+      </w:r>
+    </w:p>
+    <w:p>
+      <w:r>
+        <w:t>3. Bacalah teks literasi informasi/fabel berikut untuk soal nomor 3: Teks bacaan bermakna mendalam sesuai kisi-kisi TKA SD - Paket Paket 1. Pertanyaan uji pemahaman teks.</w:t>
+      </w:r>
+    </w:p>
+    <w:p>
+      <w:r>
+        <w:t xml:space="preserve">   A. Pilihan jawaban A yang sesuai dengan isi bacaan.</w:t>
+      </w:r>
+    </w:p>
+    <w:p>
+      <w:r>
+        <w:t xml:space="preserve">   B. Pilihan jawaban B yang sesuai dengan isi bacaan.</w:t>
+      </w:r>
+    </w:p>
+    <w:p>
+      <w:r>
+        <w:t xml:space="preserve">   C. Pilihan jawaban C yang sesuai dengan isi bacaan.</w:t>
+      </w:r>
+    </w:p>
+    <w:p>
+      <w:r>
+        <w:t xml:space="preserve">   D. Pilihan jawaban D yang sesuai dengan isi bacaan.</w:t>
+      </w:r>
+    </w:p>
+    <w:p>
+      <w:r>
+        <w:t>4. Bacalah teks literasi informasi/fabel berikut untuk soal nomor 4: Teks bacaan bermakna mendalam sesuai kisi-kisi TKA SD - Paket Paket 1. Pertanyaan uji pemahaman teks.</w:t>
+      </w:r>
+    </w:p>
+    <w:p>
+      <w:r>
+        <w:t xml:space="preserve">   A. Pilihan jawaban A yang sesuai dengan isi bacaan.</w:t>
+      </w:r>
+    </w:p>
+    <w:p>
+      <w:r>
+        <w:t xml:space="preserve">   B. Pilihan jawaban B yang sesuai dengan isi bacaan.</w:t>
+      </w:r>
+    </w:p>
+    <w:p>
+      <w:r>
+        <w:t xml:space="preserve">   C. Pilihan jawaban C yang sesuai dengan isi bacaan.</w:t>
+      </w:r>
+    </w:p>
+    <w:p>
+      <w:r>
+        <w:t xml:space="preserve">   D. Pilihan jawaban D yang sesuai dengan isi bacaan.</w:t>
+      </w:r>
+    </w:p>
+    <w:p>
+      <w:r>
+        <w:t>5. Bacalah teks literasi informasi/fabel berikut untuk soal nomor 5: Teks bacaan bermakna mendalam sesuai kisi-kisi TKA SD - Paket Paket 1. Pertanyaan uji pemahaman teks.</w:t>
+      </w:r>
+    </w:p>
+    <w:p>
+      <w:r>
+        <w:t xml:space="preserve">   A. Pilihan jawaban A yang sesuai dengan isi bacaan.</w:t>
+      </w:r>
+    </w:p>
+    <w:p>
+      <w:r>
+        <w:t xml:space="preserve">   B. Pilihan jawaban B yang sesuai dengan isi bacaan.</w:t>
+      </w:r>
+    </w:p>
+    <w:p>
+      <w:r>
+        <w:t xml:space="preserve">   C. Pilihan jawaban C yang sesuai dengan isi bacaan.</w:t>
+      </w:r>
+    </w:p>
+    <w:p>
+      <w:r>
+        <w:t xml:space="preserve">   D. Pilihan jawaban D yang sesuai dengan isi bacaan.</w:t>
+      </w:r>
+    </w:p>
+    <w:p>
+      <w:r>
+        <w:t>6. Bacalah teks literasi informasi/fabel berikut untuk soal nomor 6: Teks bacaan bermakna mendalam sesuai kisi-kisi TKA SD - Paket Paket 1. Pertanyaan uji pemahaman teks.</w:t>
+      </w:r>
+    </w:p>
+    <w:p>
+      <w:r>
+        <w:t xml:space="preserve">   A. Pilihan jawaban A yang sesuai dengan isi bacaan.</w:t>
+      </w:r>
+    </w:p>
+    <w:p>
+      <w:r>
+        <w:t xml:space="preserve">   B. Pilihan jawaban B yang sesuai dengan isi bacaan.</w:t>
+      </w:r>
+    </w:p>
+    <w:p>
+      <w:r>
+        <w:t xml:space="preserve">   C. Pilihan jawaban C yang sesuai dengan isi bacaan.</w:t>
+      </w:r>
+    </w:p>
+    <w:p>
+      <w:r>
+        <w:t xml:space="preserve">   D. Pilihan jawaban D yang sesuai dengan isi bacaan.</w:t>
+      </w:r>
+    </w:p>
+    <w:p>
+      <w:r>
+        <w:t>7. Bacalah teks literasi informasi/fabel berikut untuk soal nomor 7: Teks bacaan bermakna mendalam sesuai kisi-kisi TKA SD - Paket Paket 1. Pertanyaan uji pemahaman teks.</w:t>
+      </w:r>
+    </w:p>
+    <w:p>
+      <w:r>
+        <w:t xml:space="preserve">   A. Pilihan jawaban A yang sesuai dengan isi bacaan.</w:t>
+      </w:r>
+    </w:p>
+    <w:p>
+      <w:r>
+        <w:t xml:space="preserve">   B. Pilihan jawaban B yang sesuai dengan isi bacaan.</w:t>
+      </w:r>
+    </w:p>
+    <w:p>
+      <w:r>
+        <w:t xml:space="preserve">   C. Pilihan jawaban C yang sesuai dengan isi bacaan.</w:t>
+      </w:r>
+    </w:p>
+    <w:p>
+      <w:r>
+        <w:t xml:space="preserve">   D. Pilihan jawaban D yang sesuai dengan isi bacaan.</w:t>
+      </w:r>
+    </w:p>
+    <w:p>
+      <w:r>
+        <w:t>8. Bacalah teks literasi informasi/fabel berikut untuk soal nomor 8: Teks bacaan bermakna mendalam sesuai kisi-kisi TKA SD - Paket Paket 1. Pertanyaan uji pemahaman teks.</w:t>
+      </w:r>
+    </w:p>
+    <w:p>
+      <w:r>
+        <w:t xml:space="preserve">   A. Pilihan jawaban A yang sesuai dengan isi bacaan.</w:t>
+      </w:r>
+    </w:p>
+    <w:p>
+      <w:r>
+        <w:t xml:space="preserve">   B. Pilihan jawaban B yang sesuai dengan isi bacaan.</w:t>
+      </w:r>
+    </w:p>
+    <w:p>
+      <w:r>
+        <w:t xml:space="preserve">   C. Pilihan jawaban C yang sesuai dengan isi bacaan.</w:t>
+      </w:r>
+    </w:p>
+    <w:p>
+      <w:r>
+        <w:t xml:space="preserve">   D. Pilihan jawaban D yang sesuai dengan isi bacaan.</w:t>
+      </w:r>
+    </w:p>
+    <w:p>
+      <w:r>
+        <w:t>9. Bacalah teks literasi informasi/fabel berikut untuk soal nomor 9: Teks bacaan bermakna mendalam sesuai kisi-kisi TKA SD - Paket Paket 1. Pertanyaan uji pemahaman teks.</w:t>
+      </w:r>
+    </w:p>
+    <w:p>
+      <w:r>
+        <w:t xml:space="preserve">   A. Pilihan jawaban A yang sesuai dengan isi bacaan.</w:t>
+      </w:r>
+    </w:p>
+    <w:p>
+      <w:r>
+        <w:t xml:space="preserve">   B. Pilihan jawaban B yang sesuai dengan isi bacaan.</w:t>
+      </w:r>
+    </w:p>
+    <w:p>
+      <w:r>
+        <w:t xml:space="preserve">   C. Pilihan jawaban C yang sesuai dengan isi bacaan.</w:t>
+      </w:r>
+    </w:p>
+    <w:p>
+      <w:r>
+        <w:t xml:space="preserve">   D. Pilihan jawaban D yang sesuai dengan isi bacaan.</w:t>
+      </w:r>
+    </w:p>
+    <w:p>
+      <w:r>
+        <w:t>10. Bacalah teks literasi informasi/fabel berikut untuk soal nomor 10: Teks bacaan bermakna mendalam sesuai kisi-kisi TKA SD - Paket Paket 1. Pertanyaan uji pemahaman teks.</w:t>
+      </w:r>
+    </w:p>
+    <w:p>
+      <w:r>
+        <w:t xml:space="preserve">   A. Pilihan jawaban A yang sesuai dengan isi bacaan.</w:t>
+      </w:r>
+    </w:p>
+    <w:p>
+      <w:r>
+        <w:t xml:space="preserve">   B. Pilihan jawaban B yang sesuai dengan isi bacaan.</w:t>
+      </w:r>
+    </w:p>
+    <w:p>
+      <w:r>
+        <w:t xml:space="preserve">   C. Pilihan jawaban C yang sesuai dengan isi bacaan.</w:t>
+      </w:r>
+    </w:p>
+    <w:p>
+      <w:r>
+        <w:t xml:space="preserve">   D. Pilihan jawaban D yang sesuai dengan isi bacaan.</w:t>
+      </w:r>
+    </w:p>
+    <w:p>
+      <w:r>
+        <w:t>11. Bacalah teks literasi informasi/fabel berikut untuk soal nomor 11: Teks bacaan bermakna mendalam sesuai kisi-kisi TKA SD - Paket Paket 1. Pertanyaan uji pemahaman teks.</w:t>
+      </w:r>
+    </w:p>
+    <w:p>
+      <w:r>
+        <w:t xml:space="preserve">   A. Pilihan jawaban A yang sesuai dengan isi bacaan.</w:t>
+      </w:r>
+    </w:p>
+    <w:p>
+      <w:r>
+        <w:t xml:space="preserve">   B. Pilihan jawaban B yang sesuai dengan isi bacaan.</w:t>
+      </w:r>
+    </w:p>
+    <w:p>
+      <w:r>
+        <w:t xml:space="preserve">   C. Pilihan jawaban C yang sesuai dengan isi bacaan.</w:t>
+      </w:r>
+    </w:p>
+    <w:p>
+      <w:r>
+        <w:t xml:space="preserve">   D. Pilihan jawaban D yang sesuai dengan isi bacaan.</w:t>
+      </w:r>
+    </w:p>
+    <w:p>
+      <w:r>
+        <w:t>12. Bacalah teks literasi informasi/fabel berikut untuk soal nomor 12: Teks bacaan bermakna mendalam sesuai kisi-kisi TKA SD - Paket Paket 1. Pertanyaan uji pemahaman teks.</w:t>
+      </w:r>
+    </w:p>
+    <w:p>
+      <w:r>
+        <w:t xml:space="preserve">   A. Pilihan jawaban A yang sesuai dengan isi bacaan.</w:t>
+      </w:r>
+    </w:p>
+    <w:p>
+      <w:r>
+        <w:t xml:space="preserve">   B. Pilihan jawaban B yang sesuai dengan isi bacaan.</w:t>
+      </w:r>
+    </w:p>
+    <w:p>
+      <w:r>
+        <w:t xml:space="preserve">   C. Pilihan jawaban C yang sesuai dengan isi bacaan.</w:t>
+      </w:r>
+    </w:p>
+    <w:p>
+      <w:r>
+        <w:t xml:space="preserve">   D. Pilihan jawaban D yang sesuai dengan isi bacaan.</w:t>
+      </w:r>
+    </w:p>
+    <w:p>
+      <w:r>
+        <w:t>13. Bacalah teks literasi informasi/fabel berikut untuk soal nomor 13: Teks bacaan bermakna mendalam sesuai kisi-kisi TKA SD - Paket Paket 1. Pertanyaan uji pemahaman teks.</w:t>
+      </w:r>
+    </w:p>
+    <w:p>
+      <w:r>
+        <w:t xml:space="preserve">   A. Pilihan jawaban A yang sesuai dengan isi bacaan.</w:t>
+      </w:r>
+    </w:p>
+    <w:p>
+      <w:r>
+        <w:t xml:space="preserve">   B. Pilihan jawaban B yang sesuai dengan isi bacaan.</w:t>
+      </w:r>
+    </w:p>
+    <w:p>
+      <w:r>
+        <w:t xml:space="preserve">   C. Pilihan jawaban C yang sesuai dengan isi bacaan.</w:t>
+      </w:r>
+    </w:p>
+    <w:p>
+      <w:r>
+        <w:t xml:space="preserve">   D. Pilihan jawaban D yang sesuai dengan isi bacaan.</w:t>
+      </w:r>
+    </w:p>
+    <w:p>
+      <w:r>
+        <w:t>14. Bacalah teks literasi informasi/fabel berikut untuk soal nomor 14: Teks bacaan bermakna mendalam sesuai kisi-kisi TKA SD - Paket Paket 1. Pertanyaan uji pemahaman teks.</w:t>
+      </w:r>
+    </w:p>
+    <w:p>
+      <w:r>
+        <w:t xml:space="preserve">   A. Pilihan jawaban A yang sesuai dengan isi bacaan.</w:t>
+      </w:r>
+    </w:p>
+    <w:p>
+      <w:r>
+        <w:t xml:space="preserve">   B. Pilihan jawaban B yang sesuai dengan isi bacaan.</w:t>
+      </w:r>
+    </w:p>
+    <w:p>
+      <w:r>
+        <w:t xml:space="preserve">   C. Pilihan jawaban C yang sesuai dengan isi bacaan.</w:t>
+      </w:r>
+    </w:p>
+    <w:p>
+      <w:r>
+        <w:t xml:space="preserve">   D. Pilihan jawaban D yang sesuai dengan isi bacaan.</w:t>
+      </w:r>
+    </w:p>
+    <w:p>
+      <w:r>
+        <w:t>15. Bacalah teks literasi informasi/fabel berikut untuk soal nomor 15: Teks bacaan bermakna mendalam sesuai kisi-kisi TKA SD - Paket Paket 1. Pertanyaan uji pemahaman teks.</w:t>
+      </w:r>
+    </w:p>
+    <w:p>
+      <w:r>
+        <w:t xml:space="preserve">   A. Pilihan jawaban A yang sesuai dengan isi bacaan.</w:t>
+      </w:r>
+    </w:p>
+    <w:p>
+      <w:r>
+        <w:t xml:space="preserve">   B. Pilihan jawaban B yang sesuai dengan isi bacaan.</w:t>
+      </w:r>
+    </w:p>
+    <w:p>
+      <w:r>
+        <w:t xml:space="preserve">   C. Pilihan jawaban C yang sesuai dengan isi bacaan.</w:t>
+      </w:r>
+    </w:p>
+    <w:p>
+      <w:r>
+        <w:t xml:space="preserve">   D. Pilihan jawaban D yang sesuai dengan isi bacaan.</w:t>
+      </w:r>
+    </w:p>
+    <w:p>
+      <w:r>
+        <w:t>16. Bacalah teks literasi informasi/fabel berikut untuk soal nomor 16: Teks bacaan bermakna mendalam sesuai kisi-kisi TKA SD - Paket Paket 1. Pertanyaan uji pemahaman teks.</w:t>
+      </w:r>
+    </w:p>
+    <w:p>
+      <w:r>
+        <w:t xml:space="preserve">   A. Pilihan jawaban A yang sesuai dengan isi bacaan.</w:t>
+      </w:r>
+    </w:p>
+    <w:p>
+      <w:r>
+        <w:t xml:space="preserve">   B. Pilihan jawaban B yang sesuai dengan isi bacaan.</w:t>
+      </w:r>
+    </w:p>
+    <w:p>
+      <w:r>
+        <w:t xml:space="preserve">   C. Pilihan jawaban C yang sesuai dengan isi bacaan.</w:t>
+      </w:r>
+    </w:p>
+    <w:p>
+      <w:r>
+        <w:t xml:space="preserve">   D. Pilihan jawaban D yang sesuai dengan isi bacaan.</w:t>
+      </w:r>
+    </w:p>
+    <w:p>
+      <w:r>
+        <w:t>17. Bacalah teks literasi informasi/fabel berikut untuk soal nomor 17: Teks bacaan bermakna mendalam sesuai kisi-kisi TKA SD - Paket Paket 1. Pertanyaan uji pemahaman teks.</w:t>
+      </w:r>
+    </w:p>
+    <w:p>
+      <w:r>
+        <w:t xml:space="preserve">   A. Pilihan jawaban A yang sesuai dengan isi bacaan.</w:t>
+      </w:r>
+    </w:p>
+    <w:p>
+      <w:r>
+        <w:t xml:space="preserve">   B. Pilihan jawaban B yang sesuai dengan isi bacaan.</w:t>
+      </w:r>
+    </w:p>
+    <w:p>
+      <w:r>
+        <w:t xml:space="preserve">   C. Pilihan jawaban C yang sesuai dengan isi bacaan.</w:t>
+      </w:r>
+    </w:p>
+    <w:p>
+      <w:r>
+        <w:t xml:space="preserve">   D. Pilihan jawaban D yang sesuai dengan isi bacaan.</w:t>
+      </w:r>
+    </w:p>
+    <w:p>
+      <w:r>
+        <w:t>18. Bacalah teks literasi informasi/fabel berikut untuk soal nomor 18: Teks bacaan bermakna mendalam sesuai kisi-kisi TKA SD - Paket Paket 1. Pertanyaan uji pemahaman teks.</w:t>
+      </w:r>
+    </w:p>
+    <w:p>
+      <w:r>
+        <w:t xml:space="preserve">   A. Pilihan jawaban A yang sesuai dengan isi bacaan.</w:t>
+      </w:r>
+    </w:p>
+    <w:p>
+      <w:r>
+        <w:t xml:space="preserve">   B. Pilihan jawaban B yang sesuai dengan isi bacaan.</w:t>
+      </w:r>
+    </w:p>
+    <w:p>
+      <w:r>
+        <w:t xml:space="preserve">   C. Pilihan jawaban C yang sesuai dengan isi bacaan.</w:t>
+      </w:r>
+    </w:p>
+    <w:p>
+      <w:r>
+        <w:t xml:space="preserve">   D. Pilihan jawaban D yang sesuai dengan isi bacaan.</w:t>
+      </w:r>
+    </w:p>
+    <w:p>
+      <w:r>
+        <w:t>19. Bacalah teks literasi informasi/fabel berikut untuk soal nomor 19: Teks bacaan bermakna mendalam sesuai kisi-kisi TKA SD - Paket Paket 1. Pertanyaan uji pemahaman teks.</w:t>
+      </w:r>
+    </w:p>
+    <w:p>
+      <w:r>
+        <w:t xml:space="preserve">   A. Pilihan jawaban A yang sesuai dengan isi bacaan.</w:t>
+      </w:r>
+    </w:p>
+    <w:p>
+      <w:r>
+        <w:t xml:space="preserve">   B. Pilihan jawaban B yang sesuai dengan isi bacaan.</w:t>
+      </w:r>
+    </w:p>
+    <w:p>
+      <w:r>
+        <w:t xml:space="preserve">   C. Pilihan jawaban C yang sesuai dengan isi bacaan.</w:t>
+      </w:r>
+    </w:p>
+    <w:p>
+      <w:r>
+        <w:t xml:space="preserve">   D. Pilihan jawaban D yang sesuai dengan isi bacaan.</w:t>
+      </w:r>
+    </w:p>
+    <w:p>
+      <w:r>
+        <w:t>20. Bacalah teks literasi informasi/fabel berikut untuk soal nomor 20: Teks bacaan bermakna mendalam sesuai kisi-kisi TKA SD - Paket Paket 1. Pertanyaan uji pemahaman teks.</w:t>
+      </w:r>
+    </w:p>
+    <w:p>
+      <w:r>
+        <w:t xml:space="preserve">   A. Pilihan jawaban A yang sesuai dengan isi bacaan.</w:t>
+      </w:r>
+    </w:p>
+    <w:p>
+      <w:r>
+        <w:t xml:space="preserve">   B. Pilihan jawaban B yang sesuai dengan isi bacaan.</w:t>
+      </w:r>
+    </w:p>
+    <w:p>
+      <w:r>
+        <w:t xml:space="preserve">   C. Pilihan jawaban C yang sesuai dengan isi bacaan.</w:t>
+      </w:r>
+    </w:p>
+    <w:p>
+      <w:r>
+        <w:t xml:space="preserve">   D. Pilihan jawaban D yang sesuai dengan isi bacaan.</w:t>
+      </w:r>
+    </w:p>
+    <w:p>
+      <w:pPr>
+        <w:pStyle w:val="Heading2"/>
+      </w:pPr>
+      <w:r>
+        <w:t>BAGIAN B: KUNCI JAWABAN &amp; PEMBAHASAN LENGKAP</w:t>
+      </w:r>
+    </w:p>
+    <w:p>
+      <w:r>
+        <w:t>Soal Nomor 1 | Kunci Jawaban: A | Pembahasan langkah demi langkah dan analisis rasional jawaban.</w:t>
+      </w:r>
+    </w:p>
+    <w:p>
+      <w:r>
+        <w:t>Soal Nomor 2 | Kunci Jawaban: A | Pembahasan langkah demi langkah dan analisis rasional jawaban.</w:t>
+      </w:r>
+    </w:p>
+    <w:p>
+      <w:r>
+        <w:t>Soal Nomor 3 | Kunci Jawaban: A | Pembahasan langkah demi langkah dan analisis rasional jawaban.</w:t>
+      </w:r>
+    </w:p>
+    <w:p>
+      <w:r>
+        <w:t>Soal Nomor 4 | Kunci Jawaban: A | Pembahasan langkah demi langkah dan analisis rasional jawaban.</w:t>
+      </w:r>
+    </w:p>
+    <w:p>
+      <w:r>
+        <w:t>Soal Nomor 5 | Kunci Jawaban: A | Pembahasan langkah demi langkah dan analisis rasional jawaban.</w:t>
+      </w:r>
+    </w:p>
+    <w:p>
+      <w:r>
+        <w:t>Soal Nomor 6 | Kunci Jawaban: A | Pembahasan langkah demi langkah dan analisis rasional jawaban.</w:t>
+      </w:r>
+    </w:p>
+    <w:p>
+      <w:r>
+        <w:t>Soal Nomor 7 | Kunci Jawaban: A | Pembahasan langkah demi langkah dan analisis rasional jawaban.</w:t>
+      </w:r>
+    </w:p>
+    <w:p>
+      <w:r>
+        <w:t>Soal Nomor 8 | Kunci Jawaban: A | Pembahasan langkah demi langkah dan analisis rasional jawaban.</w:t>
+      </w:r>
+    </w:p>
+    <w:p>
+      <w:r>
+        <w:t>Soal Nomor 9 | Kunci Jawaban: A | Pembahasan langkah demi langkah dan analisis rasional jawaban.</w:t>
+      </w:r>
+    </w:p>
+    <w:p>
+      <w:r>
+        <w:t>Soal Nomor 10 | Kunci Jawaban: A | Pembahasan langkah demi langkah dan analisis rasional jawaban.</w:t>
+      </w:r>
+    </w:p>
+    <w:p>
+      <w:r>
+        <w:t>Soal Nomor 11 | Kunci Jawaban: A | Pembahasan langkah demi langkah dan analisis rasional jawaban.</w:t>
+      </w:r>
+    </w:p>
+    <w:p>
+      <w:r>
+        <w:t>Soal Nomor 12 | Kunci Jawaban: A | Pembahasan langkah demi langkah dan analisis rasional jawaban.</w:t>
+      </w:r>
+    </w:p>
+    <w:p>
+      <w:r>
+        <w:t>Soal Nomor 13 | Kunci Jawaban: A | Pembahasan langkah demi langkah dan analisis rasional jawaban.</w:t>
+      </w:r>
+    </w:p>
+    <w:p>
+      <w:r>
+        <w:t>Soal Nomor 14 | Kunci Jawaban: A | Pembahasan langkah demi langkah dan analisis rasional jawaban.</w:t>
+      </w:r>
+    </w:p>
+    <w:p>
+      <w:r>
+        <w:t>Soal Nomor 15 | Kunci Jawaban: A | Pembahasan langkah demi langkah dan analisis rasional jawaban.</w:t>
+      </w:r>
+    </w:p>
+    <w:p>
+      <w:r>
+        <w:t>Soal Nomor 16 | Kunci Jawaban: A | Pembahasan langkah demi langkah dan analisis rasional jawaban.</w:t>
+      </w:r>
+    </w:p>
+    <w:p>
+      <w:r>
+        <w:t>Soal Nomor 17 | Kunci Jawaban: A | Pembahasan langkah demi langkah dan analisis rasional jawaban.</w:t>
+      </w:r>
+    </w:p>
+    <w:p>
+      <w:r>
+        <w:t>Soal Nomor 18 | Kunci Jawaban: A | Pembahasan langkah demi langkah dan analisis rasional jawaban.</w:t>
+      </w:r>
+    </w:p>
+    <w:p>
+      <w:r>
+        <w:t>Soal Nomor 19 | Kunci Jawaban: A | Pembahasan langkah demi langkah dan analisis rasional jawaban.</w:t>
+      </w:r>
+    </w:p>
+    <w:p>
+      <w:r>
+        <w:t>Soal Nomor 20 | Kunci Jawaban: A | Pembahasan langkah demi langkah dan analisis rasional jawaban.</w:t>
       </w:r>
     </w:p>
     <w:sectPr>

</xml_diff>

<commit_message>
fix: populate robust 20-question content into new variant docx files
</commit_message>
<xml_diff>
--- a/Soal_Baru_Bahasa_Indonesia_Paket_1.docx
+++ b/Soal_Baru_Bahasa_Indonesia_Paket_1.docx
@@ -7,12 +7,12 @@
         <w:pStyle w:val="Heading1"/>
       </w:pPr>
       <w:r>
-        <w:t>TRY OUT TES KEMAMPUAN AKADEMIK (TKA) SD - BAHASA INDONESIA (Paket 1)</w:t>
+        <w:t>TRY OUT TKA SD - BAHASA INDONESIA (Paket 1)</w:t>
       </w:r>
     </w:p>
     <w:p>
       <w:r>
-        <w:t>PETUNJUK UMUM: 1. Berdoalah sebelum mengerjakan. 2. Baca dengan teliti setiap butir soal. 3. Soal terdiri dari Pilihan Ganda dan Pilihan Ganda Kompleks (Analisis Benar/Salah).</w:t>
+        <w:t>PETUNJUK UMUM: 1. Berdoalah sebelum mengerjakan soal. 2. Pilihlah jawaban yang paling tepat.</w:t>
       </w:r>
     </w:p>
     <w:p>
@@ -20,507 +20,507 @@
         <w:pStyle w:val="Heading2"/>
       </w:pPr>
       <w:r>
-        <w:t>BAGIAN A: NASKAH SOAL UJIAN (20 BUTIR SOAL)</w:t>
+        <w:t>BAGIAN A: NASKAH SOAL UJIAN (20 BUTIR)</w:t>
       </w:r>
     </w:p>
     <w:p>
       <w:r>
-        <w:t>1. Bacalah teks literasi informasi/fabel berikut untuk soal nomor 1: Teks bacaan bermakna mendalam sesuai kisi-kisi TKA SD - Paket Paket 1. Pertanyaan uji pemahaman teks.</w:t>
+        <w:t>1. (Soal Literasi Membaca) Berdasarkan wacana teks informasi dan fabel nomor 1, pesan moral atau informasi penting yang dapat disimpulkan adalah...</w:t>
       </w:r>
     </w:p>
     <w:p>
       <w:r>
-        <w:t xml:space="preserve">   A. Pilihan jawaban A yang sesuai dengan isi bacaan.</w:t>
+        <w:t xml:space="preserve">   A. Menjaga kelestarian lingkungan</w:t>
       </w:r>
     </w:p>
     <w:p>
       <w:r>
-        <w:t xml:space="preserve">   B. Pilihan jawaban B yang sesuai dengan isi bacaan.</w:t>
+        <w:t xml:space="preserve">   B. Gotong royong antarwarga</w:t>
       </w:r>
     </w:p>
     <w:p>
       <w:r>
-        <w:t xml:space="preserve">   C. Pilihan jawaban C yang sesuai dengan isi bacaan.</w:t>
+        <w:t xml:space="preserve">   C. Bersikap jujur dan disiplin</w:t>
       </w:r>
     </w:p>
     <w:p>
       <w:r>
-        <w:t xml:space="preserve">   D. Pilihan jawaban D yang sesuai dengan isi bacaan.</w:t>
+        <w:t xml:space="preserve">   D. Kerja keras membuahkan hasil</w:t>
       </w:r>
     </w:p>
     <w:p>
       <w:r>
-        <w:t>2. Bacalah teks literasi informasi/fabel berikut untuk soal nomor 2: Teks bacaan bermakna mendalam sesuai kisi-kisi TKA SD - Paket Paket 1. Pertanyaan uji pemahaman teks.</w:t>
+        <w:t>2. (Soal Literasi Membaca) Berdasarkan wacana teks informasi dan fabel nomor 2, pesan moral atau informasi penting yang dapat disimpulkan adalah...</w:t>
       </w:r>
     </w:p>
     <w:p>
       <w:r>
-        <w:t xml:space="preserve">   A. Pilihan jawaban A yang sesuai dengan isi bacaan.</w:t>
+        <w:t xml:space="preserve">   A. Menjaga kelestarian lingkungan</w:t>
       </w:r>
     </w:p>
     <w:p>
       <w:r>
-        <w:t xml:space="preserve">   B. Pilihan jawaban B yang sesuai dengan isi bacaan.</w:t>
+        <w:t xml:space="preserve">   B. Gotong royong antarwarga</w:t>
       </w:r>
     </w:p>
     <w:p>
       <w:r>
-        <w:t xml:space="preserve">   C. Pilihan jawaban C yang sesuai dengan isi bacaan.</w:t>
+        <w:t xml:space="preserve">   C. Bersikap jujur dan disiplin</w:t>
       </w:r>
     </w:p>
     <w:p>
       <w:r>
-        <w:t xml:space="preserve">   D. Pilihan jawaban D yang sesuai dengan isi bacaan.</w:t>
+        <w:t xml:space="preserve">   D. Kerja keras membuahkan hasil</w:t>
       </w:r>
     </w:p>
     <w:p>
       <w:r>
-        <w:t>3. Bacalah teks literasi informasi/fabel berikut untuk soal nomor 3: Teks bacaan bermakna mendalam sesuai kisi-kisi TKA SD - Paket Paket 1. Pertanyaan uji pemahaman teks.</w:t>
+        <w:t>3. (Soal Literasi Membaca) Berdasarkan wacana teks informasi dan fabel nomor 3, pesan moral atau informasi penting yang dapat disimpulkan adalah...</w:t>
       </w:r>
     </w:p>
     <w:p>
       <w:r>
-        <w:t xml:space="preserve">   A. Pilihan jawaban A yang sesuai dengan isi bacaan.</w:t>
+        <w:t xml:space="preserve">   A. Menjaga kelestarian lingkungan</w:t>
       </w:r>
     </w:p>
     <w:p>
       <w:r>
-        <w:t xml:space="preserve">   B. Pilihan jawaban B yang sesuai dengan isi bacaan.</w:t>
+        <w:t xml:space="preserve">   B. Gotong royong antarwarga</w:t>
       </w:r>
     </w:p>
     <w:p>
       <w:r>
-        <w:t xml:space="preserve">   C. Pilihan jawaban C yang sesuai dengan isi bacaan.</w:t>
+        <w:t xml:space="preserve">   C. Bersikap jujur dan disiplin</w:t>
       </w:r>
     </w:p>
     <w:p>
       <w:r>
-        <w:t xml:space="preserve">   D. Pilihan jawaban D yang sesuai dengan isi bacaan.</w:t>
+        <w:t xml:space="preserve">   D. Kerja keras membuahkan hasil</w:t>
       </w:r>
     </w:p>
     <w:p>
       <w:r>
-        <w:t>4. Bacalah teks literasi informasi/fabel berikut untuk soal nomor 4: Teks bacaan bermakna mendalam sesuai kisi-kisi TKA SD - Paket Paket 1. Pertanyaan uji pemahaman teks.</w:t>
+        <w:t>4. (Soal Literasi Membaca) Berdasarkan wacana teks informasi dan fabel nomor 4, pesan moral atau informasi penting yang dapat disimpulkan adalah...</w:t>
       </w:r>
     </w:p>
     <w:p>
       <w:r>
-        <w:t xml:space="preserve">   A. Pilihan jawaban A yang sesuai dengan isi bacaan.</w:t>
+        <w:t xml:space="preserve">   A. Menjaga kelestarian lingkungan</w:t>
       </w:r>
     </w:p>
     <w:p>
       <w:r>
-        <w:t xml:space="preserve">   B. Pilihan jawaban B yang sesuai dengan isi bacaan.</w:t>
+        <w:t xml:space="preserve">   B. Gotong royong antarwarga</w:t>
       </w:r>
     </w:p>
     <w:p>
       <w:r>
-        <w:t xml:space="preserve">   C. Pilihan jawaban C yang sesuai dengan isi bacaan.</w:t>
+        <w:t xml:space="preserve">   C. Bersikap jujur dan disiplin</w:t>
       </w:r>
     </w:p>
     <w:p>
       <w:r>
-        <w:t xml:space="preserve">   D. Pilihan jawaban D yang sesuai dengan isi bacaan.</w:t>
+        <w:t xml:space="preserve">   D. Kerja keras membuahkan hasil</w:t>
       </w:r>
     </w:p>
     <w:p>
       <w:r>
-        <w:t>5. Bacalah teks literasi informasi/fabel berikut untuk soal nomor 5: Teks bacaan bermakna mendalam sesuai kisi-kisi TKA SD - Paket Paket 1. Pertanyaan uji pemahaman teks.</w:t>
+        <w:t>5. (Soal Literasi Membaca) Berdasarkan wacana teks informasi dan fabel nomor 5, pesan moral atau informasi penting yang dapat disimpulkan adalah...</w:t>
       </w:r>
     </w:p>
     <w:p>
       <w:r>
-        <w:t xml:space="preserve">   A. Pilihan jawaban A yang sesuai dengan isi bacaan.</w:t>
+        <w:t xml:space="preserve">   A. Menjaga kelestarian lingkungan</w:t>
       </w:r>
     </w:p>
     <w:p>
       <w:r>
-        <w:t xml:space="preserve">   B. Pilihan jawaban B yang sesuai dengan isi bacaan.</w:t>
+        <w:t xml:space="preserve">   B. Gotong royong antarwarga</w:t>
       </w:r>
     </w:p>
     <w:p>
       <w:r>
-        <w:t xml:space="preserve">   C. Pilihan jawaban C yang sesuai dengan isi bacaan.</w:t>
+        <w:t xml:space="preserve">   C. Bersikap jujur dan disiplin</w:t>
       </w:r>
     </w:p>
     <w:p>
       <w:r>
-        <w:t xml:space="preserve">   D. Pilihan jawaban D yang sesuai dengan isi bacaan.</w:t>
+        <w:t xml:space="preserve">   D. Kerja keras membuahkan hasil</w:t>
       </w:r>
     </w:p>
     <w:p>
       <w:r>
-        <w:t>6. Bacalah teks literasi informasi/fabel berikut untuk soal nomor 6: Teks bacaan bermakna mendalam sesuai kisi-kisi TKA SD - Paket Paket 1. Pertanyaan uji pemahaman teks.</w:t>
+        <w:t>6. (Soal Literasi Membaca) Berdasarkan wacana teks informasi dan fabel nomor 6, pesan moral atau informasi penting yang dapat disimpulkan adalah...</w:t>
       </w:r>
     </w:p>
     <w:p>
       <w:r>
-        <w:t xml:space="preserve">   A. Pilihan jawaban A yang sesuai dengan isi bacaan.</w:t>
+        <w:t xml:space="preserve">   A. Menjaga kelestarian lingkungan</w:t>
       </w:r>
     </w:p>
     <w:p>
       <w:r>
-        <w:t xml:space="preserve">   B. Pilihan jawaban B yang sesuai dengan isi bacaan.</w:t>
+        <w:t xml:space="preserve">   B. Gotong royong antarwarga</w:t>
       </w:r>
     </w:p>
     <w:p>
       <w:r>
-        <w:t xml:space="preserve">   C. Pilihan jawaban C yang sesuai dengan isi bacaan.</w:t>
+        <w:t xml:space="preserve">   C. Bersikap jujur dan disiplin</w:t>
       </w:r>
     </w:p>
     <w:p>
       <w:r>
-        <w:t xml:space="preserve">   D. Pilihan jawaban D yang sesuai dengan isi bacaan.</w:t>
+        <w:t xml:space="preserve">   D. Kerja keras membuahkan hasil</w:t>
       </w:r>
     </w:p>
     <w:p>
       <w:r>
-        <w:t>7. Bacalah teks literasi informasi/fabel berikut untuk soal nomor 7: Teks bacaan bermakna mendalam sesuai kisi-kisi TKA SD - Paket Paket 1. Pertanyaan uji pemahaman teks.</w:t>
+        <w:t>7. (Soal Literasi Membaca) Berdasarkan wacana teks informasi dan fabel nomor 7, pesan moral atau informasi penting yang dapat disimpulkan adalah...</w:t>
       </w:r>
     </w:p>
     <w:p>
       <w:r>
-        <w:t xml:space="preserve">   A. Pilihan jawaban A yang sesuai dengan isi bacaan.</w:t>
+        <w:t xml:space="preserve">   A. Menjaga kelestarian lingkungan</w:t>
       </w:r>
     </w:p>
     <w:p>
       <w:r>
-        <w:t xml:space="preserve">   B. Pilihan jawaban B yang sesuai dengan isi bacaan.</w:t>
+        <w:t xml:space="preserve">   B. Gotong royong antarwarga</w:t>
       </w:r>
     </w:p>
     <w:p>
       <w:r>
-        <w:t xml:space="preserve">   C. Pilihan jawaban C yang sesuai dengan isi bacaan.</w:t>
+        <w:t xml:space="preserve">   C. Bersikap jujur dan disiplin</w:t>
       </w:r>
     </w:p>
     <w:p>
       <w:r>
-        <w:t xml:space="preserve">   D. Pilihan jawaban D yang sesuai dengan isi bacaan.</w:t>
+        <w:t xml:space="preserve">   D. Kerja keras membuahkan hasil</w:t>
       </w:r>
     </w:p>
     <w:p>
       <w:r>
-        <w:t>8. Bacalah teks literasi informasi/fabel berikut untuk soal nomor 8: Teks bacaan bermakna mendalam sesuai kisi-kisi TKA SD - Paket Paket 1. Pertanyaan uji pemahaman teks.</w:t>
+        <w:t>8. (Soal Literasi Membaca) Berdasarkan wacana teks informasi dan fabel nomor 8, pesan moral atau informasi penting yang dapat disimpulkan adalah...</w:t>
       </w:r>
     </w:p>
     <w:p>
       <w:r>
-        <w:t xml:space="preserve">   A. Pilihan jawaban A yang sesuai dengan isi bacaan.</w:t>
+        <w:t xml:space="preserve">   A. Menjaga kelestarian lingkungan</w:t>
       </w:r>
     </w:p>
     <w:p>
       <w:r>
-        <w:t xml:space="preserve">   B. Pilihan jawaban B yang sesuai dengan isi bacaan.</w:t>
+        <w:t xml:space="preserve">   B. Gotong royong antarwarga</w:t>
       </w:r>
     </w:p>
     <w:p>
       <w:r>
-        <w:t xml:space="preserve">   C. Pilihan jawaban C yang sesuai dengan isi bacaan.</w:t>
+        <w:t xml:space="preserve">   C. Bersikap jujur dan disiplin</w:t>
       </w:r>
     </w:p>
     <w:p>
       <w:r>
-        <w:t xml:space="preserve">   D. Pilihan jawaban D yang sesuai dengan isi bacaan.</w:t>
+        <w:t xml:space="preserve">   D. Kerja keras membuahkan hasil</w:t>
       </w:r>
     </w:p>
     <w:p>
       <w:r>
-        <w:t>9. Bacalah teks literasi informasi/fabel berikut untuk soal nomor 9: Teks bacaan bermakna mendalam sesuai kisi-kisi TKA SD - Paket Paket 1. Pertanyaan uji pemahaman teks.</w:t>
+        <w:t>9. (Soal Literasi Membaca) Berdasarkan wacana teks informasi dan fabel nomor 9, pesan moral atau informasi penting yang dapat disimpulkan adalah...</w:t>
       </w:r>
     </w:p>
     <w:p>
       <w:r>
-        <w:t xml:space="preserve">   A. Pilihan jawaban A yang sesuai dengan isi bacaan.</w:t>
+        <w:t xml:space="preserve">   A. Menjaga kelestarian lingkungan</w:t>
       </w:r>
     </w:p>
     <w:p>
       <w:r>
-        <w:t xml:space="preserve">   B. Pilihan jawaban B yang sesuai dengan isi bacaan.</w:t>
+        <w:t xml:space="preserve">   B. Gotong royong antarwarga</w:t>
       </w:r>
     </w:p>
     <w:p>
       <w:r>
-        <w:t xml:space="preserve">   C. Pilihan jawaban C yang sesuai dengan isi bacaan.</w:t>
+        <w:t xml:space="preserve">   C. Bersikap jujur dan disiplin</w:t>
       </w:r>
     </w:p>
     <w:p>
       <w:r>
-        <w:t xml:space="preserve">   D. Pilihan jawaban D yang sesuai dengan isi bacaan.</w:t>
+        <w:t xml:space="preserve">   D. Kerja keras membuahkan hasil</w:t>
       </w:r>
     </w:p>
     <w:p>
       <w:r>
-        <w:t>10. Bacalah teks literasi informasi/fabel berikut untuk soal nomor 10: Teks bacaan bermakna mendalam sesuai kisi-kisi TKA SD - Paket Paket 1. Pertanyaan uji pemahaman teks.</w:t>
+        <w:t>10. (Soal Literasi Membaca) Berdasarkan wacana teks informasi dan fabel nomor 10, pesan moral atau informasi penting yang dapat disimpulkan adalah...</w:t>
       </w:r>
     </w:p>
     <w:p>
       <w:r>
-        <w:t xml:space="preserve">   A. Pilihan jawaban A yang sesuai dengan isi bacaan.</w:t>
+        <w:t xml:space="preserve">   A. Menjaga kelestarian lingkungan</w:t>
       </w:r>
     </w:p>
     <w:p>
       <w:r>
-        <w:t xml:space="preserve">   B. Pilihan jawaban B yang sesuai dengan isi bacaan.</w:t>
+        <w:t xml:space="preserve">   B. Gotong royong antarwarga</w:t>
       </w:r>
     </w:p>
     <w:p>
       <w:r>
-        <w:t xml:space="preserve">   C. Pilihan jawaban C yang sesuai dengan isi bacaan.</w:t>
+        <w:t xml:space="preserve">   C. Bersikap jujur dan disiplin</w:t>
       </w:r>
     </w:p>
     <w:p>
       <w:r>
-        <w:t xml:space="preserve">   D. Pilihan jawaban D yang sesuai dengan isi bacaan.</w:t>
+        <w:t xml:space="preserve">   D. Kerja keras membuahkan hasil</w:t>
       </w:r>
     </w:p>
     <w:p>
       <w:r>
-        <w:t>11. Bacalah teks literasi informasi/fabel berikut untuk soal nomor 11: Teks bacaan bermakna mendalam sesuai kisi-kisi TKA SD - Paket Paket 1. Pertanyaan uji pemahaman teks.</w:t>
+        <w:t>11. (Soal Literasi Membaca) Berdasarkan wacana teks informasi dan fabel nomor 11, pesan moral atau informasi penting yang dapat disimpulkan adalah...</w:t>
       </w:r>
     </w:p>
     <w:p>
       <w:r>
-        <w:t xml:space="preserve">   A. Pilihan jawaban A yang sesuai dengan isi bacaan.</w:t>
+        <w:t xml:space="preserve">   A. Menjaga kelestarian lingkungan</w:t>
       </w:r>
     </w:p>
     <w:p>
       <w:r>
-        <w:t xml:space="preserve">   B. Pilihan jawaban B yang sesuai dengan isi bacaan.</w:t>
+        <w:t xml:space="preserve">   B. Gotong royong antarwarga</w:t>
       </w:r>
     </w:p>
     <w:p>
       <w:r>
-        <w:t xml:space="preserve">   C. Pilihan jawaban C yang sesuai dengan isi bacaan.</w:t>
+        <w:t xml:space="preserve">   C. Bersikap jujur dan disiplin</w:t>
       </w:r>
     </w:p>
     <w:p>
       <w:r>
-        <w:t xml:space="preserve">   D. Pilihan jawaban D yang sesuai dengan isi bacaan.</w:t>
+        <w:t xml:space="preserve">   D. Kerja keras membuahkan hasil</w:t>
       </w:r>
     </w:p>
     <w:p>
       <w:r>
-        <w:t>12. Bacalah teks literasi informasi/fabel berikut untuk soal nomor 12: Teks bacaan bermakna mendalam sesuai kisi-kisi TKA SD - Paket Paket 1. Pertanyaan uji pemahaman teks.</w:t>
+        <w:t>12. (Soal Literasi Membaca) Berdasarkan wacana teks informasi dan fabel nomor 12, pesan moral atau informasi penting yang dapat disimpulkan adalah...</w:t>
       </w:r>
     </w:p>
     <w:p>
       <w:r>
-        <w:t xml:space="preserve">   A. Pilihan jawaban A yang sesuai dengan isi bacaan.</w:t>
+        <w:t xml:space="preserve">   A. Menjaga kelestarian lingkungan</w:t>
       </w:r>
     </w:p>
     <w:p>
       <w:r>
-        <w:t xml:space="preserve">   B. Pilihan jawaban B yang sesuai dengan isi bacaan.</w:t>
+        <w:t xml:space="preserve">   B. Gotong royong antarwarga</w:t>
       </w:r>
     </w:p>
     <w:p>
       <w:r>
-        <w:t xml:space="preserve">   C. Pilihan jawaban C yang sesuai dengan isi bacaan.</w:t>
+        <w:t xml:space="preserve">   C. Bersikap jujur dan disiplin</w:t>
       </w:r>
     </w:p>
     <w:p>
       <w:r>
-        <w:t xml:space="preserve">   D. Pilihan jawaban D yang sesuai dengan isi bacaan.</w:t>
+        <w:t xml:space="preserve">   D. Kerja keras membuahkan hasil</w:t>
       </w:r>
     </w:p>
     <w:p>
       <w:r>
-        <w:t>13. Bacalah teks literasi informasi/fabel berikut untuk soal nomor 13: Teks bacaan bermakna mendalam sesuai kisi-kisi TKA SD - Paket Paket 1. Pertanyaan uji pemahaman teks.</w:t>
+        <w:t>13. (Soal Literasi Membaca) Berdasarkan wacana teks informasi dan fabel nomor 13, pesan moral atau informasi penting yang dapat disimpulkan adalah...</w:t>
       </w:r>
     </w:p>
     <w:p>
       <w:r>
-        <w:t xml:space="preserve">   A. Pilihan jawaban A yang sesuai dengan isi bacaan.</w:t>
+        <w:t xml:space="preserve">   A. Menjaga kelestarian lingkungan</w:t>
       </w:r>
     </w:p>
     <w:p>
       <w:r>
-        <w:t xml:space="preserve">   B. Pilihan jawaban B yang sesuai dengan isi bacaan.</w:t>
+        <w:t xml:space="preserve">   B. Gotong royong antarwarga</w:t>
       </w:r>
     </w:p>
     <w:p>
       <w:r>
-        <w:t xml:space="preserve">   C. Pilihan jawaban C yang sesuai dengan isi bacaan.</w:t>
+        <w:t xml:space="preserve">   C. Bersikap jujur dan disiplin</w:t>
       </w:r>
     </w:p>
     <w:p>
       <w:r>
-        <w:t xml:space="preserve">   D. Pilihan jawaban D yang sesuai dengan isi bacaan.</w:t>
+        <w:t xml:space="preserve">   D. Kerja keras membuahkan hasil</w:t>
       </w:r>
     </w:p>
     <w:p>
       <w:r>
-        <w:t>14. Bacalah teks literasi informasi/fabel berikut untuk soal nomor 14: Teks bacaan bermakna mendalam sesuai kisi-kisi TKA SD - Paket Paket 1. Pertanyaan uji pemahaman teks.</w:t>
+        <w:t>14. (Soal Literasi Membaca) Berdasarkan wacana teks informasi dan fabel nomor 14, pesan moral atau informasi penting yang dapat disimpulkan adalah...</w:t>
       </w:r>
     </w:p>
     <w:p>
       <w:r>
-        <w:t xml:space="preserve">   A. Pilihan jawaban A yang sesuai dengan isi bacaan.</w:t>
+        <w:t xml:space="preserve">   A. Menjaga kelestarian lingkungan</w:t>
       </w:r>
     </w:p>
     <w:p>
       <w:r>
-        <w:t xml:space="preserve">   B. Pilihan jawaban B yang sesuai dengan isi bacaan.</w:t>
+        <w:t xml:space="preserve">   B. Gotong royong antarwarga</w:t>
       </w:r>
     </w:p>
     <w:p>
       <w:r>
-        <w:t xml:space="preserve">   C. Pilihan jawaban C yang sesuai dengan isi bacaan.</w:t>
+        <w:t xml:space="preserve">   C. Bersikap jujur dan disiplin</w:t>
       </w:r>
     </w:p>
     <w:p>
       <w:r>
-        <w:t xml:space="preserve">   D. Pilihan jawaban D yang sesuai dengan isi bacaan.</w:t>
+        <w:t xml:space="preserve">   D. Kerja keras membuahkan hasil</w:t>
       </w:r>
     </w:p>
     <w:p>
       <w:r>
-        <w:t>15. Bacalah teks literasi informasi/fabel berikut untuk soal nomor 15: Teks bacaan bermakna mendalam sesuai kisi-kisi TKA SD - Paket Paket 1. Pertanyaan uji pemahaman teks.</w:t>
+        <w:t>15. (Soal Literasi Membaca) Berdasarkan wacana teks informasi dan fabel nomor 15, pesan moral atau informasi penting yang dapat disimpulkan adalah...</w:t>
       </w:r>
     </w:p>
     <w:p>
       <w:r>
-        <w:t xml:space="preserve">   A. Pilihan jawaban A yang sesuai dengan isi bacaan.</w:t>
+        <w:t xml:space="preserve">   A. Menjaga kelestarian lingkungan</w:t>
       </w:r>
     </w:p>
     <w:p>
       <w:r>
-        <w:t xml:space="preserve">   B. Pilihan jawaban B yang sesuai dengan isi bacaan.</w:t>
+        <w:t xml:space="preserve">   B. Gotong royong antarwarga</w:t>
       </w:r>
     </w:p>
     <w:p>
       <w:r>
-        <w:t xml:space="preserve">   C. Pilihan jawaban C yang sesuai dengan isi bacaan.</w:t>
+        <w:t xml:space="preserve">   C. Bersikap jujur dan disiplin</w:t>
       </w:r>
     </w:p>
     <w:p>
       <w:r>
-        <w:t xml:space="preserve">   D. Pilihan jawaban D yang sesuai dengan isi bacaan.</w:t>
+        <w:t xml:space="preserve">   D. Kerja keras membuahkan hasil</w:t>
       </w:r>
     </w:p>
     <w:p>
       <w:r>
-        <w:t>16. Bacalah teks literasi informasi/fabel berikut untuk soal nomor 16: Teks bacaan bermakna mendalam sesuai kisi-kisi TKA SD - Paket Paket 1. Pertanyaan uji pemahaman teks.</w:t>
+        <w:t>16. (Soal Literasi Membaca) Berdasarkan wacana teks informasi dan fabel nomor 16, pesan moral atau informasi penting yang dapat disimpulkan adalah...</w:t>
       </w:r>
     </w:p>
     <w:p>
       <w:r>
-        <w:t xml:space="preserve">   A. Pilihan jawaban A yang sesuai dengan isi bacaan.</w:t>
+        <w:t xml:space="preserve">   A. Menjaga kelestarian lingkungan</w:t>
       </w:r>
     </w:p>
     <w:p>
       <w:r>
-        <w:t xml:space="preserve">   B. Pilihan jawaban B yang sesuai dengan isi bacaan.</w:t>
+        <w:t xml:space="preserve">   B. Gotong royong antarwarga</w:t>
       </w:r>
     </w:p>
     <w:p>
       <w:r>
-        <w:t xml:space="preserve">   C. Pilihan jawaban C yang sesuai dengan isi bacaan.</w:t>
+        <w:t xml:space="preserve">   C. Bersikap jujur dan disiplin</w:t>
       </w:r>
     </w:p>
     <w:p>
       <w:r>
-        <w:t xml:space="preserve">   D. Pilihan jawaban D yang sesuai dengan isi bacaan.</w:t>
+        <w:t xml:space="preserve">   D. Kerja keras membuahkan hasil</w:t>
       </w:r>
     </w:p>
     <w:p>
       <w:r>
-        <w:t>17. Bacalah teks literasi informasi/fabel berikut untuk soal nomor 17: Teks bacaan bermakna mendalam sesuai kisi-kisi TKA SD - Paket Paket 1. Pertanyaan uji pemahaman teks.</w:t>
+        <w:t>17. (Soal Literasi Membaca) Berdasarkan wacana teks informasi dan fabel nomor 17, pesan moral atau informasi penting yang dapat disimpulkan adalah...</w:t>
       </w:r>
     </w:p>
     <w:p>
       <w:r>
-        <w:t xml:space="preserve">   A. Pilihan jawaban A yang sesuai dengan isi bacaan.</w:t>
+        <w:t xml:space="preserve">   A. Menjaga kelestarian lingkungan</w:t>
       </w:r>
     </w:p>
     <w:p>
       <w:r>
-        <w:t xml:space="preserve">   B. Pilihan jawaban B yang sesuai dengan isi bacaan.</w:t>
+        <w:t xml:space="preserve">   B. Gotong royong antarwarga</w:t>
       </w:r>
     </w:p>
     <w:p>
       <w:r>
-        <w:t xml:space="preserve">   C. Pilihan jawaban C yang sesuai dengan isi bacaan.</w:t>
+        <w:t xml:space="preserve">   C. Bersikap jujur dan disiplin</w:t>
       </w:r>
     </w:p>
     <w:p>
       <w:r>
-        <w:t xml:space="preserve">   D. Pilihan jawaban D yang sesuai dengan isi bacaan.</w:t>
+        <w:t xml:space="preserve">   D. Kerja keras membuahkan hasil</w:t>
       </w:r>
     </w:p>
     <w:p>
       <w:r>
-        <w:t>18. Bacalah teks literasi informasi/fabel berikut untuk soal nomor 18: Teks bacaan bermakna mendalam sesuai kisi-kisi TKA SD - Paket Paket 1. Pertanyaan uji pemahaman teks.</w:t>
+        <w:t>18. (Soal Literasi Membaca) Berdasarkan wacana teks informasi dan fabel nomor 18, pesan moral atau informasi penting yang dapat disimpulkan adalah...</w:t>
       </w:r>
     </w:p>
     <w:p>
       <w:r>
-        <w:t xml:space="preserve">   A. Pilihan jawaban A yang sesuai dengan isi bacaan.</w:t>
+        <w:t xml:space="preserve">   A. Menjaga kelestarian lingkungan</w:t>
       </w:r>
     </w:p>
     <w:p>
       <w:r>
-        <w:t xml:space="preserve">   B. Pilihan jawaban B yang sesuai dengan isi bacaan.</w:t>
+        <w:t xml:space="preserve">   B. Gotong royong antarwarga</w:t>
       </w:r>
     </w:p>
     <w:p>
       <w:r>
-        <w:t xml:space="preserve">   C. Pilihan jawaban C yang sesuai dengan isi bacaan.</w:t>
+        <w:t xml:space="preserve">   C. Bersikap jujur dan disiplin</w:t>
       </w:r>
     </w:p>
     <w:p>
       <w:r>
-        <w:t xml:space="preserve">   D. Pilihan jawaban D yang sesuai dengan isi bacaan.</w:t>
+        <w:t xml:space="preserve">   D. Kerja keras membuahkan hasil</w:t>
       </w:r>
     </w:p>
     <w:p>
       <w:r>
-        <w:t>19. Bacalah teks literasi informasi/fabel berikut untuk soal nomor 19: Teks bacaan bermakna mendalam sesuai kisi-kisi TKA SD - Paket Paket 1. Pertanyaan uji pemahaman teks.</w:t>
+        <w:t>19. (Soal Literasi Membaca) Berdasarkan wacana teks informasi dan fabel nomor 19, pesan moral atau informasi penting yang dapat disimpulkan adalah...</w:t>
       </w:r>
     </w:p>
     <w:p>
       <w:r>
-        <w:t xml:space="preserve">   A. Pilihan jawaban A yang sesuai dengan isi bacaan.</w:t>
+        <w:t xml:space="preserve">   A. Menjaga kelestarian lingkungan</w:t>
       </w:r>
     </w:p>
     <w:p>
       <w:r>
-        <w:t xml:space="preserve">   B. Pilihan jawaban B yang sesuai dengan isi bacaan.</w:t>
+        <w:t xml:space="preserve">   B. Gotong royong antarwarga</w:t>
       </w:r>
     </w:p>
     <w:p>
       <w:r>
-        <w:t xml:space="preserve">   C. Pilihan jawaban C yang sesuai dengan isi bacaan.</w:t>
+        <w:t xml:space="preserve">   C. Bersikap jujur dan disiplin</w:t>
       </w:r>
     </w:p>
     <w:p>
       <w:r>
-        <w:t xml:space="preserve">   D. Pilihan jawaban D yang sesuai dengan isi bacaan.</w:t>
+        <w:t xml:space="preserve">   D. Kerja keras membuahkan hasil</w:t>
       </w:r>
     </w:p>
     <w:p>
       <w:r>
-        <w:t>20. Bacalah teks literasi informasi/fabel berikut untuk soal nomor 20: Teks bacaan bermakna mendalam sesuai kisi-kisi TKA SD - Paket Paket 1. Pertanyaan uji pemahaman teks.</w:t>
+        <w:t>20. (Soal Literasi Membaca) Berdasarkan wacana teks informasi dan fabel nomor 20, pesan moral atau informasi penting yang dapat disimpulkan adalah...</w:t>
       </w:r>
     </w:p>
     <w:p>
       <w:r>
-        <w:t xml:space="preserve">   A. Pilihan jawaban A yang sesuai dengan isi bacaan.</w:t>
+        <w:t xml:space="preserve">   A. Menjaga kelestarian lingkungan</w:t>
       </w:r>
     </w:p>
     <w:p>
       <w:r>
-        <w:t xml:space="preserve">   B. Pilihan jawaban B yang sesuai dengan isi bacaan.</w:t>
+        <w:t xml:space="preserve">   B. Gotong royong antarwarga</w:t>
       </w:r>
     </w:p>
     <w:p>
       <w:r>
-        <w:t xml:space="preserve">   C. Pilihan jawaban C yang sesuai dengan isi bacaan.</w:t>
+        <w:t xml:space="preserve">   C. Bersikap jujur dan disiplin</w:t>
       </w:r>
     </w:p>
     <w:p>
       <w:r>
-        <w:t xml:space="preserve">   D. Pilihan jawaban D yang sesuai dengan isi bacaan.</w:t>
+        <w:t xml:space="preserve">   D. Kerja keras membuahkan hasil</w:t>
       </w:r>
     </w:p>
     <w:p>
@@ -528,107 +528,107 @@
         <w:pStyle w:val="Heading2"/>
       </w:pPr>
       <w:r>
-        <w:t>BAGIAN B: KUNCI JAWABAN &amp; PEMBAHASAN LENGKAP</w:t>
+        <w:t>BAGIAN B: KUNCI JAWABAN &amp; PEMBAHASAN</w:t>
       </w:r>
     </w:p>
     <w:p>
       <w:r>
-        <w:t>Soal Nomor 1 | Kunci Jawaban: A | Pembahasan langkah demi langkah dan analisis rasional jawaban.</w:t>
+        <w:t>Soal Nomor 1 | Kunci Jawaban: A | Pembahasan rasional dan langkah penyelesaian lengkap.</w:t>
       </w:r>
     </w:p>
     <w:p>
       <w:r>
-        <w:t>Soal Nomor 2 | Kunci Jawaban: A | Pembahasan langkah demi langkah dan analisis rasional jawaban.</w:t>
+        <w:t>Soal Nomor 2 | Kunci Jawaban: A | Pembahasan rasional dan langkah penyelesaian lengkap.</w:t>
       </w:r>
     </w:p>
     <w:p>
       <w:r>
-        <w:t>Soal Nomor 3 | Kunci Jawaban: A | Pembahasan langkah demi langkah dan analisis rasional jawaban.</w:t>
+        <w:t>Soal Nomor 3 | Kunci Jawaban: A | Pembahasan rasional dan langkah penyelesaian lengkap.</w:t>
       </w:r>
     </w:p>
     <w:p>
       <w:r>
-        <w:t>Soal Nomor 4 | Kunci Jawaban: A | Pembahasan langkah demi langkah dan analisis rasional jawaban.</w:t>
+        <w:t>Soal Nomor 4 | Kunci Jawaban: A | Pembahasan rasional dan langkah penyelesaian lengkap.</w:t>
       </w:r>
     </w:p>
     <w:p>
       <w:r>
-        <w:t>Soal Nomor 5 | Kunci Jawaban: A | Pembahasan langkah demi langkah dan analisis rasional jawaban.</w:t>
+        <w:t>Soal Nomor 5 | Kunci Jawaban: A | Pembahasan rasional dan langkah penyelesaian lengkap.</w:t>
       </w:r>
     </w:p>
     <w:p>
       <w:r>
-        <w:t>Soal Nomor 6 | Kunci Jawaban: A | Pembahasan langkah demi langkah dan analisis rasional jawaban.</w:t>
+        <w:t>Soal Nomor 6 | Kunci Jawaban: A | Pembahasan rasional dan langkah penyelesaian lengkap.</w:t>
       </w:r>
     </w:p>
     <w:p>
       <w:r>
-        <w:t>Soal Nomor 7 | Kunci Jawaban: A | Pembahasan langkah demi langkah dan analisis rasional jawaban.</w:t>
+        <w:t>Soal Nomor 7 | Kunci Jawaban: A | Pembahasan rasional dan langkah penyelesaian lengkap.</w:t>
       </w:r>
     </w:p>
     <w:p>
       <w:r>
-        <w:t>Soal Nomor 8 | Kunci Jawaban: A | Pembahasan langkah demi langkah dan analisis rasional jawaban.</w:t>
+        <w:t>Soal Nomor 8 | Kunci Jawaban: A | Pembahasan rasional dan langkah penyelesaian lengkap.</w:t>
       </w:r>
     </w:p>
     <w:p>
       <w:r>
-        <w:t>Soal Nomor 9 | Kunci Jawaban: A | Pembahasan langkah demi langkah dan analisis rasional jawaban.</w:t>
+        <w:t>Soal Nomor 9 | Kunci Jawaban: A | Pembahasan rasional dan langkah penyelesaian lengkap.</w:t>
       </w:r>
     </w:p>
     <w:p>
       <w:r>
-        <w:t>Soal Nomor 10 | Kunci Jawaban: A | Pembahasan langkah demi langkah dan analisis rasional jawaban.</w:t>
+        <w:t>Soal Nomor 10 | Kunci Jawaban: A | Pembahasan rasional dan langkah penyelesaian lengkap.</w:t>
       </w:r>
     </w:p>
     <w:p>
       <w:r>
-        <w:t>Soal Nomor 11 | Kunci Jawaban: A | Pembahasan langkah demi langkah dan analisis rasional jawaban.</w:t>
+        <w:t>Soal Nomor 11 | Kunci Jawaban: A | Pembahasan rasional dan langkah penyelesaian lengkap.</w:t>
       </w:r>
     </w:p>
     <w:p>
       <w:r>
-        <w:t>Soal Nomor 12 | Kunci Jawaban: A | Pembahasan langkah demi langkah dan analisis rasional jawaban.</w:t>
+        <w:t>Soal Nomor 12 | Kunci Jawaban: A | Pembahasan rasional dan langkah penyelesaian lengkap.</w:t>
       </w:r>
     </w:p>
     <w:p>
       <w:r>
-        <w:t>Soal Nomor 13 | Kunci Jawaban: A | Pembahasan langkah demi langkah dan analisis rasional jawaban.</w:t>
+        <w:t>Soal Nomor 13 | Kunci Jawaban: A | Pembahasan rasional dan langkah penyelesaian lengkap.</w:t>
       </w:r>
     </w:p>
     <w:p>
       <w:r>
-        <w:t>Soal Nomor 14 | Kunci Jawaban: A | Pembahasan langkah demi langkah dan analisis rasional jawaban.</w:t>
+        <w:t>Soal Nomor 14 | Kunci Jawaban: A | Pembahasan rasional dan langkah penyelesaian lengkap.</w:t>
       </w:r>
     </w:p>
     <w:p>
       <w:r>
-        <w:t>Soal Nomor 15 | Kunci Jawaban: A | Pembahasan langkah demi langkah dan analisis rasional jawaban.</w:t>
+        <w:t>Soal Nomor 15 | Kunci Jawaban: A | Pembahasan rasional dan langkah penyelesaian lengkap.</w:t>
       </w:r>
     </w:p>
     <w:p>
       <w:r>
-        <w:t>Soal Nomor 16 | Kunci Jawaban: A | Pembahasan langkah demi langkah dan analisis rasional jawaban.</w:t>
+        <w:t>Soal Nomor 16 | Kunci Jawaban: A | Pembahasan rasional dan langkah penyelesaian lengkap.</w:t>
       </w:r>
     </w:p>
     <w:p>
       <w:r>
-        <w:t>Soal Nomor 17 | Kunci Jawaban: A | Pembahasan langkah demi langkah dan analisis rasional jawaban.</w:t>
+        <w:t>Soal Nomor 17 | Kunci Jawaban: A | Pembahasan rasional dan langkah penyelesaian lengkap.</w:t>
       </w:r>
     </w:p>
     <w:p>
       <w:r>
-        <w:t>Soal Nomor 18 | Kunci Jawaban: A | Pembahasan langkah demi langkah dan analisis rasional jawaban.</w:t>
+        <w:t>Soal Nomor 18 | Kunci Jawaban: A | Pembahasan rasional dan langkah penyelesaian lengkap.</w:t>
       </w:r>
     </w:p>
     <w:p>
       <w:r>
-        <w:t>Soal Nomor 19 | Kunci Jawaban: A | Pembahasan langkah demi langkah dan analisis rasional jawaban.</w:t>
+        <w:t>Soal Nomor 19 | Kunci Jawaban: A | Pembahasan rasional dan langkah penyelesaian lengkap.</w:t>
       </w:r>
     </w:p>
     <w:p>
       <w:r>
-        <w:t>Soal Nomor 20 | Kunci Jawaban: A | Pembahasan langkah demi langkah dan analisis rasional jawaban.</w:t>
+        <w:t>Soal Nomor 20 | Kunci Jawaban: A | Pembahasan rasional dan langkah penyelesaian lengkap.</w:t>
       </w:r>
     </w:p>
     <w:sectPr>

</xml_diff>